<commit_message>
Fix Word report bullet rendering
</commit_message>
<xml_diff>
--- a/docs/submission_design_report_20260629.docx
+++ b/docs/submission_design_report_20260629.docx
@@ -1613,11 +1613,9 @@
       <w:r>
         <w:rPr>
           <w:rFonts w:ascii="??" w:hAnsi="??" w:eastAsia="??"/>
-          <w:b w:val="0"/>
           <w:color w:val="000000"/>
-          <w:sz w:val="21"/>
         </w:rPr>
-        <w:t>? 模型结构：TinySPAN C32/B4，32 个特征通道，4 个 TinySPAN block。</w:t>
+        <w:t>- 模型结构：TinySPAN C32/B4，32 个特征通道，4 个 TinySPAN block。</w:t>
       </w:r>
     </w:p>
     <w:p>
@@ -1628,11 +1626,9 @@
       <w:r>
         <w:rPr>
           <w:rFonts w:ascii="??" w:hAnsi="??" w:eastAsia="??"/>
-          <w:b w:val="0"/>
           <w:color w:val="000000"/>
-          <w:sz w:val="21"/>
         </w:rPr>
-        <w:t>? 输入格式：RGB888 LR frame / LR tile。</w:t>
+        <w:t>- 输入格式：RGB888 LR frame / LR tile。</w:t>
       </w:r>
     </w:p>
     <w:p>
@@ -1643,11 +1639,9 @@
       <w:r>
         <w:rPr>
           <w:rFonts w:ascii="??" w:hAnsi="??" w:eastAsia="??"/>
-          <w:b w:val="0"/>
           <w:color w:val="000000"/>
-          <w:sz w:val="21"/>
         </w:rPr>
-        <w:t>? 输出格式：RGB888 SR frame。</w:t>
+        <w:t>- 输出格式：RGB888 SR frame。</w:t>
       </w:r>
     </w:p>
     <w:p>
@@ -1658,11 +1652,9 @@
       <w:r>
         <w:rPr>
           <w:rFonts w:ascii="??" w:hAnsi="??" w:eastAsia="??"/>
-          <w:b w:val="0"/>
           <w:color w:val="000000"/>
-          <w:sz w:val="21"/>
         </w:rPr>
-        <w:t>? 量化：W8A8，权重 INT8、激活 INT8，bias/requant 参数由 quant plan 固化。</w:t>
+        <w:t>- 量化：W8A8，权重 INT8、激活 INT8，bias/requant 参数由 quant plan 固化。</w:t>
       </w:r>
     </w:p>
     <w:p>
@@ -1673,11 +1665,9 @@
       <w:r>
         <w:rPr>
           <w:rFonts w:ascii="??" w:hAnsi="??" w:eastAsia="??"/>
-          <w:b w:val="0"/>
           <w:color w:val="000000"/>
-          <w:sz w:val="21"/>
         </w:rPr>
-        <w:t>? X4 硬件安全基线：c32b4_30fps_frozen_20260613。</w:t>
+        <w:t>- X4 硬件安全基线：c32b4_30fps_frozen_20260613。</w:t>
       </w:r>
     </w:p>
     <w:p>
@@ -1688,11 +1678,9 @@
       <w:r>
         <w:rPr>
           <w:rFonts w:ascii="??" w:hAnsi="??" w:eastAsia="??"/>
-          <w:b w:val="0"/>
           <w:color w:val="000000"/>
-          <w:sz w:val="21"/>
         </w:rPr>
-        <w:t>? X2 提交 checkpoint：runs/tinyspan_frozen_candidates/x2_quality_after_x4_20260625/student_final.pt。</w:t>
+        <w:t>- X2 提交 checkpoint：runs/tinyspan_frozen_candidates/x2_quality_after_x4_20260625/student_final.pt。</w:t>
       </w:r>
     </w:p>
     <w:p>
@@ -2320,7 +2308,7 @@
       </w:pPr>
       <w:r>
         <w:rPr>
-          <w:rFonts w:ascii="Consolas" w:hAnsi="Consolas" w:eastAsia="Consolas"/>
+          <w:rFonts w:ascii="??" w:hAnsi="??" w:eastAsia="??"/>
           <w:b w:val="0"/>
           <w:color w:val="000000"/>
           <w:sz w:val="17"/>
@@ -2334,7 +2322,7 @@
       </w:pPr>
       <w:r>
         <w:rPr>
-          <w:rFonts w:ascii="Consolas" w:hAnsi="Consolas" w:eastAsia="Consolas"/>
+          <w:rFonts w:ascii="??" w:hAnsi="??" w:eastAsia="??"/>
           <w:b w:val="0"/>
           <w:color w:val="000000"/>
           <w:sz w:val="17"/>
@@ -2348,7 +2336,7 @@
       </w:pPr>
       <w:r>
         <w:rPr>
-          <w:rFonts w:ascii="Consolas" w:hAnsi="Consolas" w:eastAsia="Consolas"/>
+          <w:rFonts w:ascii="??" w:hAnsi="??" w:eastAsia="??"/>
           <w:b w:val="0"/>
           <w:color w:val="000000"/>
           <w:sz w:val="17"/>
@@ -2362,7 +2350,7 @@
       </w:pPr>
       <w:r>
         <w:rPr>
-          <w:rFonts w:ascii="Consolas" w:hAnsi="Consolas" w:eastAsia="Consolas"/>
+          <w:rFonts w:ascii="??" w:hAnsi="??" w:eastAsia="??"/>
           <w:b w:val="0"/>
           <w:color w:val="000000"/>
           <w:sz w:val="17"/>
@@ -2376,7 +2364,7 @@
       </w:pPr>
       <w:r>
         <w:rPr>
-          <w:rFonts w:ascii="Consolas" w:hAnsi="Consolas" w:eastAsia="Consolas"/>
+          <w:rFonts w:ascii="??" w:hAnsi="??" w:eastAsia="??"/>
           <w:b w:val="0"/>
           <w:color w:val="000000"/>
           <w:sz w:val="17"/>
@@ -2390,7 +2378,7 @@
       </w:pPr>
       <w:r>
         <w:rPr>
-          <w:rFonts w:ascii="Consolas" w:hAnsi="Consolas" w:eastAsia="Consolas"/>
+          <w:rFonts w:ascii="??" w:hAnsi="??" w:eastAsia="??"/>
           <w:b w:val="0"/>
           <w:color w:val="000000"/>
           <w:sz w:val="17"/>
@@ -2404,7 +2392,7 @@
       </w:pPr>
       <w:r>
         <w:rPr>
-          <w:rFonts w:ascii="Consolas" w:hAnsi="Consolas" w:eastAsia="Consolas"/>
+          <w:rFonts w:ascii="??" w:hAnsi="??" w:eastAsia="??"/>
           <w:b w:val="0"/>
           <w:color w:val="000000"/>
           <w:sz w:val="17"/>
@@ -2418,7 +2406,7 @@
       </w:pPr>
       <w:r>
         <w:rPr>
-          <w:rFonts w:ascii="Consolas" w:hAnsi="Consolas" w:eastAsia="Consolas"/>
+          <w:rFonts w:ascii="??" w:hAnsi="??" w:eastAsia="??"/>
           <w:b w:val="0"/>
           <w:color w:val="000000"/>
           <w:sz w:val="17"/>
@@ -2448,11 +2436,9 @@
       <w:r>
         <w:rPr>
           <w:rFonts w:ascii="??" w:hAnsi="??" w:eastAsia="??"/>
-          <w:b w:val="0"/>
           <w:color w:val="000000"/>
-          <w:sz w:val="21"/>
         </w:rPr>
-        <w:t>? X4 checkpoint SHA256：6A3AA4FE17CDF1027483F95BE8A99A5805BCDD61CC821074603DE65BF333D938</w:t>
+        <w:t>- X4 checkpoint SHA256：6A3AA4FE17CDF1027483F95BE8A99A5805BCDD61CC821074603DE65BF333D938</w:t>
       </w:r>
     </w:p>
     <w:p>
@@ -2463,11 +2449,9 @@
       <w:r>
         <w:rPr>
           <w:rFonts w:ascii="??" w:hAnsi="??" w:eastAsia="??"/>
-          <w:b w:val="0"/>
           <w:color w:val="000000"/>
-          <w:sz w:val="21"/>
         </w:rPr>
-        <w:t>? X4 quant plan SHA256：EB6EEDDDE9360F61E6FC30141B2A1E6539E519CB226AC18B8C219B9E40092C9D</w:t>
+        <w:t>- X4 quant plan SHA256：EB6EEDDDE9360F61E6FC30141B2A1E6539E519CB226AC18B8C219B9E40092C9D</w:t>
       </w:r>
     </w:p>
     <w:p>
@@ -2478,11 +2462,9 @@
       <w:r>
         <w:rPr>
           <w:rFonts w:ascii="??" w:hAnsi="??" w:eastAsia="??"/>
-          <w:b w:val="0"/>
           <w:color w:val="000000"/>
-          <w:sz w:val="21"/>
         </w:rPr>
-        <w:t>? X2 checkpoint SHA256：B06E66FA8FEA066F111B94CF5629919BEA05D5465F913B36851CBA92BED4A9EB</w:t>
+        <w:t>- X2 checkpoint SHA256：B06E66FA8FEA066F111B94CF5629919BEA05D5465F913B36851CBA92BED4A9EB</w:t>
       </w:r>
     </w:p>
     <w:p>
@@ -2493,11 +2475,9 @@
       <w:r>
         <w:rPr>
           <w:rFonts w:ascii="??" w:hAnsi="??" w:eastAsia="??"/>
-          <w:b w:val="0"/>
           <w:color w:val="000000"/>
-          <w:sz w:val="21"/>
         </w:rPr>
-        <w:t>? X2 quant plan SHA256：8BB154CC524B5CA00A1A3D81F0E343CF0A0BA1CF8E08AB5867656B0C53D37C2F</w:t>
+        <w:t>- X2 quant plan SHA256：8BB154CC524B5CA00A1A3D81F0E343CF0A0BA1CF8E08AB5867656B0C53D37C2F</w:t>
       </w:r>
     </w:p>
     <w:p>
@@ -2859,11 +2839,9 @@
       <w:r>
         <w:rPr>
           <w:rFonts w:ascii="??" w:hAnsi="??" w:eastAsia="??"/>
-          <w:b w:val="0"/>
           <w:color w:val="000000"/>
-          <w:sz w:val="21"/>
         </w:rPr>
-        <w:t>? X4：320x180 LR 被切为 5x3=15 个 64x64 LR tile，输出拼接为 1280x720。</w:t>
+        <w:t>- X4：320x180 LR 被切为 5x3=15 个 64x64 LR tile，输出拼接为 1280x720。</w:t>
       </w:r>
     </w:p>
     <w:p>
@@ -2874,11 +2852,9 @@
       <w:r>
         <w:rPr>
           <w:rFonts w:ascii="??" w:hAnsi="??" w:eastAsia="??"/>
-          <w:b w:val="0"/>
           <w:color w:val="000000"/>
-          <w:sz w:val="21"/>
         </w:rPr>
-        <w:t>? X2：640x360 LR 被切为 10x6=60 个 64x64 LR tile，输出拼接为 1280x720。</w:t>
+        <w:t>- X2：640x360 LR 被切为 10x6=60 个 64x64 LR tile，输出拼接为 1280x720。</w:t>
       </w:r>
     </w:p>
     <w:p>
@@ -2889,11 +2865,9 @@
       <w:r>
         <w:rPr>
           <w:rFonts w:ascii="??" w:hAnsi="??" w:eastAsia="??"/>
-          <w:b w:val="0"/>
           <w:color w:val="000000"/>
-          <w:sz w:val="21"/>
         </w:rPr>
-        <w:t>? 对右边界和下边界不足 64x64 的 tile 做 zero padding，写回时只保留有效区域。</w:t>
+        <w:t>- 对右边界和下边界不足 64x64 的 tile 做 zero padding，写回时只保留有效区域。</w:t>
       </w:r>
     </w:p>
     <w:p>
@@ -3591,11 +3565,9 @@
       <w:r>
         <w:rPr>
           <w:rFonts w:ascii="??" w:hAnsi="??" w:eastAsia="??"/>
-          <w:b w:val="0"/>
           <w:color w:val="000000"/>
-          <w:sz w:val="21"/>
         </w:rPr>
-        <w:t>? X4 Gate H：artifacts/20260618_x4_tinyspan_c32b4_baseline_30fps_safe/gate_h_board_x4_320x180_f150_tiledref_tile64_fifo_f155_20260625/manifest.json</w:t>
+        <w:t>- X4 Gate H：artifacts/20260618_x4_tinyspan_c32b4_baseline_30fps_safe/gate_h_board_x4_320x180_f150_tiledref_tile64_fifo_f155_20260625/manifest.json</w:t>
       </w:r>
     </w:p>
     <w:p>
@@ -3606,11 +3578,9 @@
       <w:r>
         <w:rPr>
           <w:rFonts w:ascii="??" w:hAnsi="??" w:eastAsia="??"/>
-          <w:b w:val="0"/>
           <w:color w:val="000000"/>
-          <w:sz w:val="21"/>
         </w:rPr>
-        <w:t>? X2 Gate H：artifacts/20260618_x4_tinyspan_c32b4_baseline_30fps_safe/gate_h_board_x2_640x360_f188_div8_tile64_rgbpipe_20260626/manifest.json</w:t>
+        <w:t>- X2 Gate H：artifacts/20260618_x4_tinyspan_c32b4_baseline_30fps_safe/gate_h_board_x2_640x360_f188_div8_tile64_rgbpipe_20260626/manifest.json</w:t>
       </w:r>
     </w:p>
     <w:p>
@@ -3621,11 +3591,9 @@
       <w:r>
         <w:rPr>
           <w:rFonts w:ascii="??" w:hAnsi="??" w:eastAsia="??"/>
-          <w:b w:val="0"/>
           <w:color w:val="000000"/>
-          <w:sz w:val="21"/>
         </w:rPr>
-        <w:t>? 交付包校验：docs/contest_delivery_package_check.md</w:t>
+        <w:t>- 交付包校验：docs/contest_delivery_package_check.md</w:t>
       </w:r>
     </w:p>
     <w:p>
@@ -3636,11 +3604,9 @@
       <w:r>
         <w:rPr>
           <w:rFonts w:ascii="??" w:hAnsi="??" w:eastAsia="??"/>
-          <w:b w:val="0"/>
           <w:color w:val="000000"/>
-          <w:sz w:val="21"/>
         </w:rPr>
-        <w:t>? 交付审计：docs/contest_delivery_audit.md</w:t>
+        <w:t>- 交付审计：docs/contest_delivery_audit.md</w:t>
       </w:r>
     </w:p>
     <w:p>
@@ -5585,11 +5551,9 @@
       <w:r>
         <w:rPr>
           <w:rFonts w:ascii="??" w:hAnsi="??" w:eastAsia="??"/>
-          <w:b w:val="0"/>
           <w:color w:val="000000"/>
-          <w:sz w:val="21"/>
         </w:rPr>
-        <w:t>? artifacts/20260618_x4_tinyspan_c32b4_baseline_30fps_safe/full_frame_tiled_reference_x4_320x180_tile64_fifo_f155_20260625/software_tiled_fixed_point_sr.png</w:t>
+        <w:t>- artifacts/20260618_x4_tinyspan_c32b4_baseline_30fps_safe/full_frame_tiled_reference_x4_320x180_tile64_fifo_f155_20260625/software_tiled_fixed_point_sr.png</w:t>
       </w:r>
     </w:p>
     <w:p>
@@ -5600,11 +5564,9 @@
       <w:r>
         <w:rPr>
           <w:rFonts w:ascii="??" w:hAnsi="??" w:eastAsia="??"/>
-          <w:b w:val="0"/>
           <w:color w:val="000000"/>
-          <w:sz w:val="21"/>
         </w:rPr>
-        <w:t>? artifacts/20260618_x4_tinyspan_c32b4_baseline_30fps_safe/full_frame_tiled_reference_x4_320x180_tile64_fifo_f155_20260625/comparison_preview.png</w:t>
+        <w:t>- artifacts/20260618_x4_tinyspan_c32b4_baseline_30fps_safe/full_frame_tiled_reference_x4_320x180_tile64_fifo_f155_20260625/comparison_preview.png</w:t>
       </w:r>
     </w:p>
     <w:p>
@@ -5615,11 +5577,9 @@
       <w:r>
         <w:rPr>
           <w:rFonts w:ascii="??" w:hAnsi="??" w:eastAsia="??"/>
-          <w:b w:val="0"/>
           <w:color w:val="000000"/>
-          <w:sz w:val="21"/>
         </w:rPr>
-        <w:t>? artifacts/20260618_x4_tinyspan_c32b4_baseline_30fps_safe/full_frame_tiled_reference_x4_320x180_tile64_fifo_f155_20260625/diff_heatmap.png</w:t>
+        <w:t>- artifacts/20260618_x4_tinyspan_c32b4_baseline_30fps_safe/full_frame_tiled_reference_x4_320x180_tile64_fifo_f155_20260625/diff_heatmap.png</w:t>
       </w:r>
     </w:p>
     <w:p>
@@ -5644,11 +5604,9 @@
       <w:r>
         <w:rPr>
           <w:rFonts w:ascii="??" w:hAnsi="??" w:eastAsia="??"/>
-          <w:b w:val="0"/>
           <w:color w:val="000000"/>
-          <w:sz w:val="21"/>
         </w:rPr>
-        <w:t>? artifacts/20260618_x4_tinyspan_c32b4_baseline_30fps_safe/gate_h_board_x2_640x360_f188_div8_tile64_rgbpipe_20260626/board_sr_a53_equal_to_fixed.png</w:t>
+        <w:t>- artifacts/20260618_x4_tinyspan_c32b4_baseline_30fps_safe/gate_h_board_x2_640x360_f188_div8_tile64_rgbpipe_20260626/board_sr_a53_equal_to_fixed.png</w:t>
       </w:r>
     </w:p>
     <w:p>
@@ -5659,11 +5617,9 @@
       <w:r>
         <w:rPr>
           <w:rFonts w:ascii="??" w:hAnsi="??" w:eastAsia="??"/>
-          <w:b w:val="0"/>
           <w:color w:val="000000"/>
-          <w:sz w:val="21"/>
         </w:rPr>
-        <w:t>? artifacts/20260618_x4_tinyspan_c32b4_baseline_30fps_safe/gate_h_board_x2_640x360_f188_div8_tile64_rgbpipe_20260626/tinyspan_board_software_preview.png</w:t>
+        <w:t>- artifacts/20260618_x4_tinyspan_c32b4_baseline_30fps_safe/gate_h_board_x2_640x360_f188_div8_tile64_rgbpipe_20260626/tinyspan_board_software_preview.png</w:t>
       </w:r>
     </w:p>
     <w:p>
@@ -5674,11 +5630,9 @@
       <w:r>
         <w:rPr>
           <w:rFonts w:ascii="??" w:hAnsi="??" w:eastAsia="??"/>
-          <w:b w:val="0"/>
           <w:color w:val="000000"/>
-          <w:sz w:val="21"/>
         </w:rPr>
-        <w:t>? artifacts/20260618_x4_tinyspan_c32b4_baseline_30fps_safe/gate_h_board_x2_640x360_f188_div8_tile64_rgbpipe_20260626/diff_heatmap.png</w:t>
+        <w:t>- artifacts/20260618_x4_tinyspan_c32b4_baseline_30fps_safe/gate_h_board_x2_640x360_f188_div8_tile64_rgbpipe_20260626/diff_heatmap.png</w:t>
       </w:r>
     </w:p>
     <w:p>
@@ -6772,11 +6726,9 @@
       <w:r>
         <w:rPr>
           <w:rFonts w:ascii="??" w:hAnsi="??" w:eastAsia="??"/>
-          <w:b w:val="0"/>
           <w:color w:val="000000"/>
-          <w:sz w:val="21"/>
         </w:rPr>
-        <w:t>? 当前提交采用已有 X2/X4 Gate H 硬件闭合方案，不继续等待 X4/X2 画质提升训练支线。</w:t>
+        <w:t>- 当前提交采用已有 X2/X4 Gate H 硬件闭合方案，不继续等待 X4/X2 画质提升训练支线。</w:t>
       </w:r>
     </w:p>
     <w:p>
@@ -6787,11 +6739,9 @@
       <w:r>
         <w:rPr>
           <w:rFonts w:ascii="??" w:hAnsi="??" w:eastAsia="??"/>
-          <w:b w:val="0"/>
           <w:color w:val="000000"/>
-          <w:sz w:val="21"/>
         </w:rPr>
-        <w:t>? X4 当前基线满足真实板上 &gt;=30fps 和 0 mismatch，但 full REDS val 画质提升有限；本次提交优先保证正确性、实时性和低资源。</w:t>
+        <w:t>- X4 当前基线满足真实板上 &gt;=30fps 和 0 mismatch，但 full REDS val 画质提升有限；本次提交优先保证正确性、实时性和低资源。</w:t>
       </w:r>
     </w:p>
     <w:p>
@@ -6802,11 +6752,9 @@
       <w:r>
         <w:rPr>
           <w:rFonts w:ascii="??" w:hAnsi="??" w:eastAsia="??"/>
-          <w:b w:val="0"/>
           <w:color w:val="000000"/>
-          <w:sz w:val="21"/>
         </w:rPr>
-        <w:t>? 当前严格验收没有把“板上 SD 卡直接读图”作为闭合证据；正式证据为 PS DDR 输入、PL 运行、A53 DDR 内比较。后续可将输入输出工程化升级为 AXI DMA/DataMover/VDMA 或 SD-&gt;DDR 流水，但不影响本提交的硬件 compute 与整帧切块验收结论。</w:t>
+        <w:t>- 当前严格验收没有把“板上 SD 卡直接读图”作为闭合证据；正式证据为 PS DDR 输入、PL 运行、A53 DDR 内比较。后续可将输入输出工程化升级为 AXI DMA/DataMover/VDMA 或 SD-&gt;DDR 流水，但不影响本提交的硬件 compute 与整帧切块验收结论。</w:t>
       </w:r>
     </w:p>
     <w:p>
@@ -6817,11 +6765,9 @@
       <w:r>
         <w:rPr>
           <w:rFonts w:ascii="??" w:hAnsi="??" w:eastAsia="??"/>
-          <w:b w:val="0"/>
           <w:color w:val="000000"/>
-          <w:sz w:val="21"/>
         </w:rPr>
-        <w:t>? 若后续切换更高 PSNR 的 X4/X2 模型，必须重新完成 checkpoint 冻结、量化、RTL/export、bitstream、真实板上 0 mismatch 和 &gt;=30fps 验收后，才能替换本提交基线。</w:t>
+        <w:t>- 若后续切换更高 PSNR 的 X4/X2 模型，必须重新完成 checkpoint 冻结、量化、RTL/export、bitstream、真实板上 0 mismatch 和 &gt;=30fps 验收后，才能替换本提交基线。</w:t>
       </w:r>
     </w:p>
     <w:sectPr>

</xml_diff>